<commit_message>
Updated revised manuscript files
</commit_message>
<xml_diff>
--- a/manuscript/revision/Blattabacterium HGT revision_PNAS_cover-letter.docx
+++ b/manuscript/revision/Blattabacterium HGT revision_PNAS_cover-letter.docx
@@ -16,16 +16,25 @@
       <w:r>
         <w:rPr>
           <w:rFonts w:ascii="Times New Roman" w:hAnsi="Times New Roman"/>
-          <w:color w:val="EE0000"/>
-          <w:sz w:val="22"/>
-          <w:szCs w:val="22"/>
-        </w:rPr>
-        <w:t>16</w:t>
+          <w:color w:val="000000" w:themeColor="text1"/>
+          <w:sz w:val="22"/>
+          <w:szCs w:val="22"/>
+        </w:rPr>
+        <w:t>1</w:t>
       </w:r>
       <w:r>
         <w:rPr>
           <w:rFonts w:ascii="Times New Roman" w:hAnsi="Times New Roman"/>
-          <w:color w:val="000000"/>
+          <w:color w:val="000000" w:themeColor="text1"/>
+          <w:sz w:val="22"/>
+          <w:szCs w:val="22"/>
+        </w:rPr>
+        <w:t>7</w:t>
+      </w:r>
+      <w:r>
+        <w:rPr>
+          <w:rFonts w:ascii="Times New Roman" w:hAnsi="Times New Roman"/>
+          <w:color w:val="000000" w:themeColor="text1"/>
           <w:sz w:val="22"/>
           <w:szCs w:val="22"/>
           <w:vertAlign w:val="superscript"/>
@@ -35,7 +44,7 @@
       <w:r>
         <w:rPr>
           <w:rFonts w:ascii="Times New Roman" w:hAnsi="Times New Roman"/>
-          <w:color w:val="000000"/>
+          <w:color w:val="000000" w:themeColor="text1"/>
           <w:sz w:val="22"/>
           <w:szCs w:val="22"/>
         </w:rPr>
@@ -44,11 +53,20 @@
       <w:r>
         <w:rPr>
           <w:rFonts w:ascii="Times New Roman" w:hAnsi="Times New Roman"/>
-          <w:color w:val="000000"/>
-          <w:sz w:val="22"/>
-          <w:szCs w:val="22"/>
-        </w:rPr>
-        <w:t>April</w:t>
+          <w:color w:val="000000" w:themeColor="text1"/>
+          <w:sz w:val="22"/>
+          <w:szCs w:val="22"/>
+        </w:rPr>
+        <w:t>A</w:t>
+      </w:r>
+      <w:r>
+        <w:rPr>
+          <w:rFonts w:ascii="Times New Roman" w:hAnsi="Times New Roman"/>
+          <w:color w:val="000000"/>
+          <w:sz w:val="22"/>
+          <w:szCs w:val="22"/>
+        </w:rPr>
+        <w:t>pril</w:t>
       </w:r>
       <w:r>
         <w:rPr>
@@ -202,34 +220,7 @@
           <w:sz w:val="22"/>
           <w:szCs w:val="22"/>
         </w:rPr>
-        <w:t>Professor</w:t>
-      </w:r>
-      <w:r>
-        <w:rPr>
-          <w:rFonts w:ascii="Times New Roman" w:hAnsi="Times New Roman"/>
-          <w:color w:val="000000"/>
-          <w:sz w:val="22"/>
-          <w:szCs w:val="22"/>
-        </w:rPr>
-        <w:t xml:space="preserve"> May </w:t>
-      </w:r>
-      <w:r>
-        <w:rPr>
-          <w:rFonts w:ascii="Times New Roman" w:hAnsi="Times New Roman"/>
-          <w:color w:val="000000"/>
-          <w:sz w:val="22"/>
-          <w:szCs w:val="22"/>
-        </w:rPr>
-        <w:t>Berenbaum</w:t>
-      </w:r>
-      <w:r>
-        <w:rPr>
-          <w:rFonts w:ascii="Times New Roman" w:hAnsi="Times New Roman"/>
-          <w:color w:val="000000"/>
-          <w:sz w:val="22"/>
-          <w:szCs w:val="22"/>
-        </w:rPr>
-        <w:t>,</w:t>
+        <w:t>Professor May Berenbaum,</w:t>
       </w:r>
     </w:p>
     <w:p>
@@ -280,7 +271,47 @@
           <w:sz w:val="22"/>
           <w:szCs w:val="22"/>
         </w:rPr>
-        <w:t xml:space="preserve"> by Kyle Ewart, Maxim Adams, Zhuzhi Zhang, Louise Baker, Kokuto Fujiwara, Yoshinobu Hayashi, Leo Featherstone, Oscar Lo Lu, Jil Helbling, Maya Moral, Kiyoto Maekawa, Harley Rose, Aaron Jex, Simon Ho and Nathan Lo.</w:t>
+        <w:t xml:space="preserve"> by Kyle Ewart, Maxim Adams, </w:t>
+      </w:r>
+      <w:proofErr w:type="spellStart"/>
+      <w:r>
+        <w:rPr>
+          <w:rFonts w:ascii="Times New Roman" w:hAnsi="Times New Roman"/>
+          <w:color w:val="000000"/>
+          <w:sz w:val="22"/>
+          <w:szCs w:val="22"/>
+        </w:rPr>
+        <w:t>Zhuzhi</w:t>
+      </w:r>
+      <w:proofErr w:type="spellEnd"/>
+      <w:r>
+        <w:rPr>
+          <w:rFonts w:ascii="Times New Roman" w:hAnsi="Times New Roman"/>
+          <w:color w:val="000000"/>
+          <w:sz w:val="22"/>
+          <w:szCs w:val="22"/>
+        </w:rPr>
+        <w:t xml:space="preserve"> Zhang, Louise Baker, </w:t>
+      </w:r>
+      <w:proofErr w:type="spellStart"/>
+      <w:r>
+        <w:rPr>
+          <w:rFonts w:ascii="Times New Roman" w:hAnsi="Times New Roman"/>
+          <w:color w:val="000000"/>
+          <w:sz w:val="22"/>
+          <w:szCs w:val="22"/>
+        </w:rPr>
+        <w:t>Kokuto</w:t>
+      </w:r>
+      <w:proofErr w:type="spellEnd"/>
+      <w:r>
+        <w:rPr>
+          <w:rFonts w:ascii="Times New Roman" w:hAnsi="Times New Roman"/>
+          <w:color w:val="000000"/>
+          <w:sz w:val="22"/>
+          <w:szCs w:val="22"/>
+        </w:rPr>
+        <w:t xml:space="preserve"> Fujiwara, Yoshinobu Hayashi, Leo Featherstone, Oscar Lo Lu, Jil Helbling, Maya Moral, Kiyoto Maekawa, Harley Rose, Aaron Jex, Simon Ho and Nathan Lo.</w:t>
       </w:r>
     </w:p>
     <w:p>
@@ -311,61 +342,7 @@
           <w:sz w:val="22"/>
           <w:szCs w:val="22"/>
         </w:rPr>
-        <w:t>We enclose our revised manuscript. We are very thankful for the comments from the Editorial Board Member</w:t>
-      </w:r>
-      <w:r>
-        <w:rPr>
-          <w:rFonts w:ascii="Times New Roman" w:hAnsi="Times New Roman"/>
-          <w:color w:val="000000"/>
-          <w:sz w:val="22"/>
-          <w:szCs w:val="22"/>
-        </w:rPr>
-        <w:t xml:space="preserve"> </w:t>
-      </w:r>
-      <w:r>
-        <w:rPr>
-          <w:rFonts w:ascii="Times New Roman" w:hAnsi="Times New Roman"/>
-          <w:color w:val="000000"/>
-          <w:sz w:val="22"/>
-          <w:szCs w:val="22"/>
-        </w:rPr>
-        <w:t>and t</w:t>
-      </w:r>
-      <w:r>
-        <w:rPr>
-          <w:rFonts w:ascii="Times New Roman" w:hAnsi="Times New Roman"/>
-          <w:color w:val="000000"/>
-          <w:sz w:val="22"/>
-          <w:szCs w:val="22"/>
-        </w:rPr>
-        <w:t>hree</w:t>
-      </w:r>
-      <w:r>
-        <w:rPr>
-          <w:rFonts w:ascii="Times New Roman" w:hAnsi="Times New Roman"/>
-          <w:color w:val="000000"/>
-          <w:sz w:val="22"/>
-          <w:szCs w:val="22"/>
-        </w:rPr>
-        <w:t xml:space="preserve"> Re</w:t>
-      </w:r>
-      <w:r>
-        <w:rPr>
-          <w:rFonts w:ascii="Times New Roman" w:hAnsi="Times New Roman"/>
-          <w:color w:val="000000"/>
-          <w:sz w:val="22"/>
-          <w:szCs w:val="22"/>
-        </w:rPr>
-        <w:t>viewers</w:t>
-      </w:r>
-      <w:r>
-        <w:rPr>
-          <w:rFonts w:ascii="Times New Roman" w:hAnsi="Times New Roman"/>
-          <w:color w:val="000000"/>
-          <w:sz w:val="22"/>
-          <w:szCs w:val="22"/>
-        </w:rPr>
-        <w:t xml:space="preserve">. We have addressed these comments as detailed in the attached ‘responses to comments’ document. We believe we have improved the manuscript following these recommendations and hope that it is now suitable for publication in </w:t>
+        <w:t xml:space="preserve">We enclose our revised manuscript. We are very thankful for the comments from the Editorial Board Member and three Reviewers. We have addressed these comments as detailed in the attached ‘responses to comments’ document. We believe we have improved the manuscript following these recommendations and hope that it is now suitable for publication in </w:t>
       </w:r>
       <w:r>
         <w:rPr>
@@ -434,7 +411,61 @@
           <w:sz w:val="22"/>
           <w:szCs w:val="22"/>
         </w:rPr>
-        <w:t xml:space="preserve"> comments (in blue) and describe (in black) how we have addressed each of them, referring to line numbers in the revised version of the manuscript. To facilitate cross-referencing, we have numbered the comments and added the prefixes ‘R1’ (=Re</w:t>
+        <w:t xml:space="preserve"> comments (in blue) and describe (in black) how we have addressed each of them, referring to line numbers in the revised version of the manuscript</w:t>
+      </w:r>
+      <w:r>
+        <w:rPr>
+          <w:rFonts w:ascii="Times New Roman" w:hAnsi="Times New Roman"/>
+          <w:color w:val="000000"/>
+          <w:sz w:val="22"/>
+          <w:szCs w:val="22"/>
+        </w:rPr>
+        <w:t xml:space="preserve"> (based on the </w:t>
+      </w:r>
+      <w:r>
+        <w:rPr>
+          <w:rFonts w:ascii="Times New Roman" w:hAnsi="Times New Roman"/>
+          <w:color w:val="000000"/>
+          <w:sz w:val="22"/>
+          <w:szCs w:val="22"/>
+        </w:rPr>
+        <w:t>manuscript file without track changes</w:t>
+      </w:r>
+      <w:r>
+        <w:rPr>
+          <w:rFonts w:ascii="Times New Roman" w:hAnsi="Times New Roman"/>
+          <w:color w:val="000000"/>
+          <w:sz w:val="22"/>
+          <w:szCs w:val="22"/>
+        </w:rPr>
+        <w:t xml:space="preserve"> </w:t>
+      </w:r>
+      <w:r>
+        <w:rPr>
+          <w:rFonts w:ascii="Times New Roman" w:hAnsi="Times New Roman"/>
+          <w:color w:val="000000"/>
+          <w:sz w:val="22"/>
+          <w:szCs w:val="22"/>
+        </w:rPr>
+        <w:t>to avoid issues with line numbering</w:t>
+      </w:r>
+      <w:r>
+        <w:rPr>
+          <w:rFonts w:ascii="Times New Roman" w:hAnsi="Times New Roman"/>
+          <w:color w:val="000000"/>
+          <w:sz w:val="22"/>
+          <w:szCs w:val="22"/>
+        </w:rPr>
+        <w:t>)</w:t>
+      </w:r>
+      <w:r>
+        <w:rPr>
+          <w:rFonts w:ascii="Times New Roman" w:hAnsi="Times New Roman"/>
+          <w:color w:val="000000"/>
+          <w:sz w:val="22"/>
+          <w:szCs w:val="22"/>
+        </w:rPr>
+        <w:t>. To facilitate cross-referencing, we have numbered the comments and added the prefixes ‘R1’ (=Re</w:t>
       </w:r>
       <w:r>
         <w:rPr>
@@ -461,6 +492,51 @@
           <w:sz w:val="22"/>
           <w:szCs w:val="22"/>
         </w:rPr>
+        <w:t xml:space="preserve"> ‘R2’ (=Reviewer 2),</w:t>
+      </w:r>
+      <w:r>
+        <w:rPr>
+          <w:rFonts w:ascii="Times New Roman" w:hAnsi="Times New Roman"/>
+          <w:color w:val="000000"/>
+          <w:sz w:val="22"/>
+          <w:szCs w:val="22"/>
+        </w:rPr>
+        <w:t xml:space="preserve"> and ‘R</w:t>
+      </w:r>
+      <w:r>
+        <w:rPr>
+          <w:rFonts w:ascii="Times New Roman" w:hAnsi="Times New Roman"/>
+          <w:color w:val="000000"/>
+          <w:sz w:val="22"/>
+          <w:szCs w:val="22"/>
+        </w:rPr>
+        <w:t>3</w:t>
+      </w:r>
+      <w:r>
+        <w:rPr>
+          <w:rFonts w:ascii="Times New Roman" w:hAnsi="Times New Roman"/>
+          <w:color w:val="000000"/>
+          <w:sz w:val="22"/>
+          <w:szCs w:val="22"/>
+        </w:rPr>
+        <w:t>’ (=Re</w:t>
+      </w:r>
+      <w:r>
+        <w:rPr>
+          <w:rFonts w:ascii="Times New Roman" w:hAnsi="Times New Roman"/>
+          <w:color w:val="000000"/>
+          <w:sz w:val="22"/>
+          <w:szCs w:val="22"/>
+        </w:rPr>
+        <w:t>viewer</w:t>
+      </w:r>
+      <w:r>
+        <w:rPr>
+          <w:rFonts w:ascii="Times New Roman" w:hAnsi="Times New Roman"/>
+          <w:color w:val="000000"/>
+          <w:sz w:val="22"/>
+          <w:szCs w:val="22"/>
+        </w:rPr>
         <w:t xml:space="preserve"> </w:t>
       </w:r>
       <w:r>
@@ -470,78 +546,6 @@
           <w:sz w:val="22"/>
           <w:szCs w:val="22"/>
         </w:rPr>
-        <w:t>‘R</w:t>
-      </w:r>
-      <w:r>
-        <w:rPr>
-          <w:rFonts w:ascii="Times New Roman" w:hAnsi="Times New Roman"/>
-          <w:color w:val="000000"/>
-          <w:sz w:val="22"/>
-          <w:szCs w:val="22"/>
-        </w:rPr>
-        <w:t>2</w:t>
-      </w:r>
-      <w:r>
-        <w:rPr>
-          <w:rFonts w:ascii="Times New Roman" w:hAnsi="Times New Roman"/>
-          <w:color w:val="000000"/>
-          <w:sz w:val="22"/>
-          <w:szCs w:val="22"/>
-        </w:rPr>
-        <w:t>’ (=Re</w:t>
-      </w:r>
-      <w:r>
-        <w:rPr>
-          <w:rFonts w:ascii="Times New Roman" w:hAnsi="Times New Roman"/>
-          <w:color w:val="000000"/>
-          <w:sz w:val="22"/>
-          <w:szCs w:val="22"/>
-        </w:rPr>
-        <w:t>viewer</w:t>
-      </w:r>
-      <w:r>
-        <w:rPr>
-          <w:rFonts w:ascii="Times New Roman" w:hAnsi="Times New Roman"/>
-          <w:color w:val="000000"/>
-          <w:sz w:val="22"/>
-          <w:szCs w:val="22"/>
-        </w:rPr>
-        <w:t xml:space="preserve"> </w:t>
-      </w:r>
-      <w:r>
-        <w:rPr>
-          <w:rFonts w:ascii="Times New Roman" w:hAnsi="Times New Roman"/>
-          <w:color w:val="000000"/>
-          <w:sz w:val="22"/>
-          <w:szCs w:val="22"/>
-        </w:rPr>
-        <w:t>2</w:t>
-      </w:r>
-      <w:r>
-        <w:rPr>
-          <w:rFonts w:ascii="Times New Roman" w:hAnsi="Times New Roman"/>
-          <w:color w:val="000000"/>
-          <w:sz w:val="22"/>
-          <w:szCs w:val="22"/>
-        </w:rPr>
-        <w:t>),</w:t>
-      </w:r>
-      <w:r>
-        <w:rPr>
-          <w:rFonts w:ascii="Times New Roman" w:hAnsi="Times New Roman"/>
-          <w:color w:val="000000"/>
-          <w:sz w:val="22"/>
-          <w:szCs w:val="22"/>
-        </w:rPr>
-        <w:t xml:space="preserve"> and ‘R</w:t>
-      </w:r>
-      <w:r>
-        <w:rPr>
-          <w:rFonts w:ascii="Times New Roman" w:hAnsi="Times New Roman"/>
-          <w:color w:val="000000"/>
-          <w:sz w:val="22"/>
-          <w:szCs w:val="22"/>
-        </w:rPr>
         <w:t>3</w:t>
       </w:r>
       <w:r>
@@ -551,73 +555,7 @@
           <w:sz w:val="22"/>
           <w:szCs w:val="22"/>
         </w:rPr>
-        <w:t>’ (=Re</w:t>
-      </w:r>
-      <w:r>
-        <w:rPr>
-          <w:rFonts w:ascii="Times New Roman" w:hAnsi="Times New Roman"/>
-          <w:color w:val="000000"/>
-          <w:sz w:val="22"/>
-          <w:szCs w:val="22"/>
-        </w:rPr>
-        <w:t>viewer</w:t>
-      </w:r>
-      <w:r>
-        <w:rPr>
-          <w:rFonts w:ascii="Times New Roman" w:hAnsi="Times New Roman"/>
-          <w:color w:val="000000"/>
-          <w:sz w:val="22"/>
-          <w:szCs w:val="22"/>
-        </w:rPr>
-        <w:t xml:space="preserve"> </w:t>
-      </w:r>
-      <w:r>
-        <w:rPr>
-          <w:rFonts w:ascii="Times New Roman" w:hAnsi="Times New Roman"/>
-          <w:color w:val="000000"/>
-          <w:sz w:val="22"/>
-          <w:szCs w:val="22"/>
-        </w:rPr>
-        <w:t>3</w:t>
-      </w:r>
-      <w:r>
-        <w:rPr>
-          <w:rFonts w:ascii="Times New Roman" w:hAnsi="Times New Roman"/>
-          <w:color w:val="000000"/>
-          <w:sz w:val="22"/>
-          <w:szCs w:val="22"/>
-        </w:rPr>
-        <w:t xml:space="preserve">). Instead of using ‘track changes’, we have highlighted changes made to the manuscript in </w:t>
-      </w:r>
-      <w:commentRangeStart w:id="0"/>
-      <w:r>
-        <w:rPr>
-          <w:rFonts w:ascii="Times New Roman" w:hAnsi="Times New Roman"/>
-          <w:color w:val="000000"/>
-          <w:sz w:val="22"/>
-          <w:szCs w:val="22"/>
-        </w:rPr>
-        <w:t xml:space="preserve">light blue </w:t>
-      </w:r>
-      <w:commentRangeEnd w:id="0"/>
-      <w:r>
-        <w:rPr>
-          <w:rStyle w:val="CommentReference"/>
-          <w:rFonts w:ascii="Times New Roman" w:hAnsi="Times New Roman"/>
-          <w:color w:val="000000"/>
-          <w:sz w:val="22"/>
-          <w:szCs w:val="22"/>
-        </w:rPr>
-        <w:commentReference w:id="0"/>
-      </w:r>
-      <w:r>
-        <w:rPr>
-          <w:rFonts w:ascii="Times New Roman" w:hAnsi="Times New Roman"/>
-          <w:color w:val="000000"/>
-          <w:sz w:val="22"/>
-          <w:szCs w:val="22"/>
-        </w:rPr>
-        <w:t xml:space="preserve">(to avoid issues with line numbering). </w:t>
+        <w:t>).</w:t>
       </w:r>
     </w:p>
     <w:p>
@@ -797,7 +735,7 @@
                     <pic:cNvPicPr/>
                   </pic:nvPicPr>
                   <pic:blipFill rotWithShape="1">
-                    <a:blip r:embed="rId12" cstate="print">
+                    <a:blip r:embed="rId8" cstate="print">
                       <a:extLst>
                         <a:ext uri="{28A0092B-C50C-407E-A947-70E740481C1C}">
                           <a14:useLocalDpi xmlns:a14="http://schemas.microsoft.com/office/drawing/2010/main" val="0"/>
@@ -894,9 +832,9 @@
       </w:pPr>
     </w:p>
     <w:sectPr>
-      <w:headerReference w:type="default" r:id="rId13"/>
-      <w:footerReference w:type="default" r:id="rId14"/>
-      <w:headerReference w:type="first" r:id="rId15"/>
+      <w:headerReference w:type="default" r:id="rId9"/>
+      <w:footerReference w:type="default" r:id="rId10"/>
+      <w:headerReference w:type="first" r:id="rId11"/>
       <w:pgSz w:w="11906" w:h="16838" w:code="9"/>
       <w:pgMar w:top="1418" w:right="1418" w:bottom="1418" w:left="1418" w:header="709" w:footer="709" w:gutter="0"/>
       <w:cols w:space="708"/>
@@ -905,45 +843,6 @@
     </w:sectPr>
   </w:body>
 </w:document>
-</file>
-
-<file path=word/comments.xml><?xml version="1.0" encoding="utf-8"?>
-<w:comments xmlns:wpc="http://schemas.microsoft.com/office/word/2010/wordprocessingCanvas" xmlns:cx="http://schemas.microsoft.com/office/drawing/2014/chartex" xmlns:cx1="http://schemas.microsoft.com/office/drawing/2015/9/8/chartex" xmlns:cx2="http://schemas.microsoft.com/office/drawing/2015/10/21/chartex" xmlns:cx3="http://schemas.microsoft.com/office/drawing/2016/5/9/chartex" xmlns:cx4="http://schemas.microsoft.com/office/drawing/2016/5/10/chartex" xmlns:cx5="http://schemas.microsoft.com/office/drawing/2016/5/11/chartex" xmlns:cx6="http://schemas.microsoft.com/office/drawing/2016/5/12/chartex" xmlns:cx7="http://schemas.microsoft.com/office/drawing/2016/5/13/chartex" xmlns:cx8="http://schemas.microsoft.com/office/drawing/2016/5/14/chartex" xmlns:mc="http://schemas.openxmlformats.org/markup-compatibility/2006" xmlns:aink="http://schemas.microsoft.com/office/drawing/2016/ink" xmlns:am3d="http://schemas.microsoft.com/office/drawing/2017/model3d" xmlns:o="urn:schemas-microsoft-com:office:office" xmlns:oel="http://schemas.microsoft.com/office/2019/extlst" xmlns:r="http://schemas.openxmlformats.org/officeDocument/2006/relationships" xmlns:m="http://schemas.openxmlformats.org/officeDocument/2006/math" xmlns:v="urn:schemas-microsoft-com:vml" xmlns:wp14="http://schemas.microsoft.com/office/word/2010/wordprocessingDrawing" xmlns:wp="http://schemas.openxmlformats.org/drawingml/2006/wordprocessingDrawing" xmlns:w10="urn:schemas-microsoft-com:office:word" xmlns:w="http://schemas.openxmlformats.org/wordprocessingml/2006/main" xmlns:w14="http://schemas.microsoft.com/office/word/2010/wordml" xmlns:w15="http://schemas.microsoft.com/office/word/2012/wordml" xmlns:w16cex="http://schemas.microsoft.com/office/word/2018/wordml/cex" xmlns:w16cid="http://schemas.microsoft.com/office/word/2016/wordml/cid" xmlns:w16="http://schemas.microsoft.com/office/word/2018/wordml" xmlns:w16du="http://schemas.microsoft.com/office/word/2023/wordml/word16du" xmlns:w16sdtdh="http://schemas.microsoft.com/office/word/2020/wordml/sdtdatahash" xmlns:w16sdtfl="http://schemas.microsoft.com/office/word/2024/wordml/sdtformatlock" xmlns:w16se="http://schemas.microsoft.com/office/word/2015/wordml/symex" xmlns:wpg="http://schemas.microsoft.com/office/word/2010/wordprocessingGroup" xmlns:wpi="http://schemas.microsoft.com/office/word/2010/wordprocessingInk" xmlns:wne="http://schemas.microsoft.com/office/word/2006/wordml" xmlns:wps="http://schemas.microsoft.com/office/word/2010/wordprocessingShape" mc:Ignorable="w14 w15 w16se w16cid w16 w16cex w16sdtdh w16sdtfl w16du wp14">
-  <w:comment w:id="0" w:author="Kyle Ewart" w:date="2026-04-14T09:37:00Z" w:initials="KE">
-    <w:p>
-      <w:pPr>
-        <w:pStyle w:val="CommentText"/>
-      </w:pPr>
-      <w:r>
-        <w:rPr>
-          <w:rStyle w:val="CommentReference"/>
-        </w:rPr>
-        <w:annotationRef/>
-      </w:r>
-      <w:r>
-        <w:t>To do</w:t>
-      </w:r>
-    </w:p>
-  </w:comment>
-</w:comments>
-</file>
-
-<file path=word/commentsExtended.xml><?xml version="1.0" encoding="utf-8"?>
-<w15:commentsEx xmlns:wpc="http://schemas.microsoft.com/office/word/2010/wordprocessingCanvas" xmlns:cx="http://schemas.microsoft.com/office/drawing/2014/chartex" xmlns:cx1="http://schemas.microsoft.com/office/drawing/2015/9/8/chartex" xmlns:cx2="http://schemas.microsoft.com/office/drawing/2015/10/21/chartex" xmlns:cx3="http://schemas.microsoft.com/office/drawing/2016/5/9/chartex" xmlns:cx4="http://schemas.microsoft.com/office/drawing/2016/5/10/chartex" xmlns:cx5="http://schemas.microsoft.com/office/drawing/2016/5/11/chartex" xmlns:cx6="http://schemas.microsoft.com/office/drawing/2016/5/12/chartex" xmlns:cx7="http://schemas.microsoft.com/office/drawing/2016/5/13/chartex" xmlns:cx8="http://schemas.microsoft.com/office/drawing/2016/5/14/chartex" xmlns:mc="http://schemas.openxmlformats.org/markup-compatibility/2006" xmlns:aink="http://schemas.microsoft.com/office/drawing/2016/ink" xmlns:am3d="http://schemas.microsoft.com/office/drawing/2017/model3d" xmlns:o="urn:schemas-microsoft-com:office:office" xmlns:oel="http://schemas.microsoft.com/office/2019/extlst" xmlns:r="http://schemas.openxmlformats.org/officeDocument/2006/relationships" xmlns:m="http://schemas.openxmlformats.org/officeDocument/2006/math" xmlns:v="urn:schemas-microsoft-com:vml" xmlns:wp14="http://schemas.microsoft.com/office/word/2010/wordprocessingDrawing" xmlns:wp="http://schemas.openxmlformats.org/drawingml/2006/wordprocessingDrawing" xmlns:w10="urn:schemas-microsoft-com:office:word" xmlns:w="http://schemas.openxmlformats.org/wordprocessingml/2006/main" xmlns:w14="http://schemas.microsoft.com/office/word/2010/wordml" xmlns:w15="http://schemas.microsoft.com/office/word/2012/wordml" xmlns:w16cex="http://schemas.microsoft.com/office/word/2018/wordml/cex" xmlns:w16cid="http://schemas.microsoft.com/office/word/2016/wordml/cid" xmlns:w16="http://schemas.microsoft.com/office/word/2018/wordml" xmlns:w16du="http://schemas.microsoft.com/office/word/2023/wordml/word16du" xmlns:w16sdtdh="http://schemas.microsoft.com/office/word/2020/wordml/sdtdatahash" xmlns:w16sdtfl="http://schemas.microsoft.com/office/word/2024/wordml/sdtformatlock" xmlns:w16se="http://schemas.microsoft.com/office/word/2015/wordml/symex" xmlns:wpg="http://schemas.microsoft.com/office/word/2010/wordprocessingGroup" xmlns:wpi="http://schemas.microsoft.com/office/word/2010/wordprocessingInk" xmlns:wne="http://schemas.microsoft.com/office/word/2006/wordml" xmlns:wps="http://schemas.microsoft.com/office/word/2010/wordprocessingShape" mc:Ignorable="w14 w15 w16se w16cid w16 w16cex w16sdtdh w16sdtfl w16du wp14">
-  <w15:commentEx w15:paraId="78DA2702" w15:done="0"/>
-</w15:commentsEx>
-</file>
-
-<file path=word/commentsExtensible.xml><?xml version="1.0" encoding="utf-8"?>
-<w16cex:commentsExtensible xmlns:wpc="http://schemas.microsoft.com/office/word/2010/wordprocessingCanvas" xmlns:cx="http://schemas.microsoft.com/office/drawing/2014/chartex" xmlns:cx1="http://schemas.microsoft.com/office/drawing/2015/9/8/chartex" xmlns:cx2="http://schemas.microsoft.com/office/drawing/2015/10/21/chartex" xmlns:cx3="http://schemas.microsoft.com/office/drawing/2016/5/9/chartex" xmlns:cx4="http://schemas.microsoft.com/office/drawing/2016/5/10/chartex" xmlns:cx5="http://schemas.microsoft.com/office/drawing/2016/5/11/chartex" xmlns:cx6="http://schemas.microsoft.com/office/drawing/2016/5/12/chartex" xmlns:cx7="http://schemas.microsoft.com/office/drawing/2016/5/13/chartex" xmlns:cx8="http://schemas.microsoft.com/office/drawing/2016/5/14/chartex" xmlns:cr="http://schemas.microsoft.com/office/comments/2020/reactions" xmlns:mc="http://schemas.openxmlformats.org/markup-compatibility/2006" xmlns:aink="http://schemas.microsoft.com/office/drawing/2016/ink" xmlns:am3d="http://schemas.microsoft.com/office/drawing/2017/model3d" xmlns:o="urn:schemas-microsoft-com:office:office" xmlns:oel="http://schemas.microsoft.com/office/2019/extlst" xmlns:r="http://schemas.openxmlformats.org/officeDocument/2006/relationships" xmlns:m="http://schemas.openxmlformats.org/officeDocument/2006/math" xmlns:v="urn:schemas-microsoft-com:vml" xmlns:wp14="http://schemas.microsoft.com/office/word/2010/wordprocessingDrawing" xmlns:wp="http://schemas.openxmlformats.org/drawingml/2006/wordprocessingDrawing" xmlns:w10="urn:schemas-microsoft-com:office:word" xmlns:w="http://schemas.openxmlformats.org/wordprocessingml/2006/main" xmlns:w14="http://schemas.microsoft.com/office/word/2010/wordml" xmlns:w15="http://schemas.microsoft.com/office/word/2012/wordml" xmlns:w16cex="http://schemas.microsoft.com/office/word/2018/wordml/cex" xmlns:w16cid="http://schemas.microsoft.com/office/word/2016/wordml/cid" xmlns:w16="http://schemas.microsoft.com/office/word/2018/wordml" xmlns:w16du="http://schemas.microsoft.com/office/word/2023/wordml/word16du" xmlns:w16sdtdh="http://schemas.microsoft.com/office/word/2020/wordml/sdtdatahash" xmlns:w16sdtfl="http://schemas.microsoft.com/office/word/2024/wordml/sdtformatlock" xmlns:w16se="http://schemas.microsoft.com/office/word/2015/wordml/symex" xmlns:wpg="http://schemas.microsoft.com/office/word/2010/wordprocessingGroup" xmlns:wpi="http://schemas.microsoft.com/office/word/2010/wordprocessingInk" xmlns:wne="http://schemas.microsoft.com/office/word/2006/wordml" xmlns:wps="http://schemas.microsoft.com/office/word/2010/wordprocessingShape" mc:Ignorable="w14 w15 w16se w16cid w16 w16cex w16sdtdh w16sdtfl cr w16du wp14">
-  <w16cex:commentExtensible w16cex:durableId="1A6E3A18" w16cex:dateUtc="2026-04-14T08:37:00Z"/>
-</w16cex:commentsExtensible>
-</file>
-
-<file path=word/commentsIds.xml><?xml version="1.0" encoding="utf-8"?>
-<w16cid:commentsIds xmlns:wpc="http://schemas.microsoft.com/office/word/2010/wordprocessingCanvas" xmlns:cx="http://schemas.microsoft.com/office/drawing/2014/chartex" xmlns:cx1="http://schemas.microsoft.com/office/drawing/2015/9/8/chartex" xmlns:cx2="http://schemas.microsoft.com/office/drawing/2015/10/21/chartex" xmlns:cx3="http://schemas.microsoft.com/office/drawing/2016/5/9/chartex" xmlns:cx4="http://schemas.microsoft.com/office/drawing/2016/5/10/chartex" xmlns:cx5="http://schemas.microsoft.com/office/drawing/2016/5/11/chartex" xmlns:cx6="http://schemas.microsoft.com/office/drawing/2016/5/12/chartex" xmlns:cx7="http://schemas.microsoft.com/office/drawing/2016/5/13/chartex" xmlns:cx8="http://schemas.microsoft.com/office/drawing/2016/5/14/chartex" xmlns:mc="http://schemas.openxmlformats.org/markup-compatibility/2006" xmlns:aink="http://schemas.microsoft.com/office/drawing/2016/ink" xmlns:am3d="http://schemas.microsoft.com/office/drawing/2017/model3d" xmlns:o="urn:schemas-microsoft-com:office:office" xmlns:oel="http://schemas.microsoft.com/office/2019/extlst" xmlns:r="http://schemas.openxmlformats.org/officeDocument/2006/relationships" xmlns:m="http://schemas.openxmlformats.org/officeDocument/2006/math" xmlns:v="urn:schemas-microsoft-com:vml" xmlns:wp14="http://schemas.microsoft.com/office/word/2010/wordprocessingDrawing" xmlns:wp="http://schemas.openxmlformats.org/drawingml/2006/wordprocessingDrawing" xmlns:w10="urn:schemas-microsoft-com:office:word" xmlns:w="http://schemas.openxmlformats.org/wordprocessingml/2006/main" xmlns:w14="http://schemas.microsoft.com/office/word/2010/wordml" xmlns:w15="http://schemas.microsoft.com/office/word/2012/wordml" xmlns:w16cex="http://schemas.microsoft.com/office/word/2018/wordml/cex" xmlns:w16cid="http://schemas.microsoft.com/office/word/2016/wordml/cid" xmlns:w16="http://schemas.microsoft.com/office/word/2018/wordml" xmlns:w16du="http://schemas.microsoft.com/office/word/2023/wordml/word16du" xmlns:w16sdtdh="http://schemas.microsoft.com/office/word/2020/wordml/sdtdatahash" xmlns:w16sdtfl="http://schemas.microsoft.com/office/word/2024/wordml/sdtformatlock" xmlns:w16se="http://schemas.microsoft.com/office/word/2015/wordml/symex" xmlns:wpg="http://schemas.microsoft.com/office/word/2010/wordprocessingGroup" xmlns:wpi="http://schemas.microsoft.com/office/word/2010/wordprocessingInk" xmlns:wne="http://schemas.microsoft.com/office/word/2006/wordml" xmlns:wps="http://schemas.microsoft.com/office/word/2010/wordprocessingShape" mc:Ignorable="w14 w15 w16se w16cid w16 w16cex w16sdtdh w16sdtfl w16du wp14">
-  <w16cid:commentId w16cid:paraId="78DA2702" w16cid:durableId="1A6E3A18"/>
-</w16cid:commentsIds>
 </file>
 
 <file path=word/endnotes.xml><?xml version="1.0" encoding="utf-8"?>
@@ -4579,14 +4478,6 @@
     <w:abstractNumId w:val="11"/>
   </w:num>
 </w:numbering>
-</file>
-
-<file path=word/people.xml><?xml version="1.0" encoding="utf-8"?>
-<w15:people xmlns:wpc="http://schemas.microsoft.com/office/word/2010/wordprocessingCanvas" xmlns:cx="http://schemas.microsoft.com/office/drawing/2014/chartex" xmlns:cx1="http://schemas.microsoft.com/office/drawing/2015/9/8/chartex" xmlns:cx2="http://schemas.microsoft.com/office/drawing/2015/10/21/chartex" xmlns:cx3="http://schemas.microsoft.com/office/drawing/2016/5/9/chartex" xmlns:cx4="http://schemas.microsoft.com/office/drawing/2016/5/10/chartex" xmlns:cx5="http://schemas.microsoft.com/office/drawing/2016/5/11/chartex" xmlns:cx6="http://schemas.microsoft.com/office/drawing/2016/5/12/chartex" xmlns:cx7="http://schemas.microsoft.com/office/drawing/2016/5/13/chartex" xmlns:cx8="http://schemas.microsoft.com/office/drawing/2016/5/14/chartex" xmlns:mc="http://schemas.openxmlformats.org/markup-compatibility/2006" xmlns:aink="http://schemas.microsoft.com/office/drawing/2016/ink" xmlns:am3d="http://schemas.microsoft.com/office/drawing/2017/model3d" xmlns:o="urn:schemas-microsoft-com:office:office" xmlns:oel="http://schemas.microsoft.com/office/2019/extlst" xmlns:r="http://schemas.openxmlformats.org/officeDocument/2006/relationships" xmlns:m="http://schemas.openxmlformats.org/officeDocument/2006/math" xmlns:v="urn:schemas-microsoft-com:vml" xmlns:wp14="http://schemas.microsoft.com/office/word/2010/wordprocessingDrawing" xmlns:wp="http://schemas.openxmlformats.org/drawingml/2006/wordprocessingDrawing" xmlns:w10="urn:schemas-microsoft-com:office:word" xmlns:w="http://schemas.openxmlformats.org/wordprocessingml/2006/main" xmlns:w14="http://schemas.microsoft.com/office/word/2010/wordml" xmlns:w15="http://schemas.microsoft.com/office/word/2012/wordml" xmlns:w16cex="http://schemas.microsoft.com/office/word/2018/wordml/cex" xmlns:w16cid="http://schemas.microsoft.com/office/word/2016/wordml/cid" xmlns:w16="http://schemas.microsoft.com/office/word/2018/wordml" xmlns:w16du="http://schemas.microsoft.com/office/word/2023/wordml/word16du" xmlns:w16sdtdh="http://schemas.microsoft.com/office/word/2020/wordml/sdtdatahash" xmlns:w16sdtfl="http://schemas.microsoft.com/office/word/2024/wordml/sdtformatlock" xmlns:w16se="http://schemas.microsoft.com/office/word/2015/wordml/symex" xmlns:wpg="http://schemas.microsoft.com/office/word/2010/wordprocessingGroup" xmlns:wpi="http://schemas.microsoft.com/office/word/2010/wordprocessingInk" xmlns:wne="http://schemas.microsoft.com/office/word/2006/wordml" xmlns:wps="http://schemas.microsoft.com/office/word/2010/wordprocessingShape" mc:Ignorable="w14 w15 w16se w16cid w16 w16cex w16sdtdh w16sdtfl w16du wp14">
-  <w15:person w15:author="Kyle Ewart">
-    <w15:presenceInfo w15:providerId="None" w15:userId="Kyle Ewart"/>
-  </w15:person>
-</w15:people>
 </file>
 
 <file path=word/styles.xml><?xml version="1.0" encoding="utf-8"?>

</xml_diff>